<commit_message>
Carreira passa a cobrir outro concurso da mesma carreira em até 12 meses
Antes o nível cobria o próximo edital do mesmo concurso, pelo mesmo órgão, em
até 24 meses. Agora cobre outro concurso público para a mesma carreira ou
cargo, ainda que de órgão ou ente diverso, com edital publicado em até 12 meses.

O contrato ganha a definição de "mesma carreira ou cargo" — atribuições e
requisitos equivalentes, ainda que a denominação, o órgão ou o ente variem —
porque sem ela o escopo ficaria em aberto.

Atualizados: os três contratos e o gerador, o texto integral em markdown, o
documento de decisão, o prompt da Bia e o texto do sp_honorario, as mensagens
prontas das três faixas, a tarefa do Claude Code, o manual da equipe, o
playbook e o PDF de referência com o HTML de origem.

Co-Authored-By: Claude Opus 5 <noreply@anthropic.com>
Claude-Session: https://claude.ai/code/session_01HdsBaSPBpCu71Qtfm8CjPP
</commit_message>
<xml_diff>
--- a/comercial/contratos/Contrato_Honorarios_CARREIRA.docx
+++ b/comercial/contratos/Contrato_Honorarios_CARREIRA.docx
@@ -441,7 +441,7 @@
       </w:pPr>
       <w:r>
         <w:rPr/>
-        <w:t xml:space="preserve">todas as fases do próximo certame para o mesmo cargo e o mesmo órgão, assim entendido o primeiro edital publicado no prazo de 24 (vinte e quatro) meses contados da assinatura deste contrato.</w:t>
+        <w:t xml:space="preserve">todas as fases de outro concurso público para a mesma carreira ou cargo, ainda que de órgão ou ente federativo diverso, cujo edital seja publicado no prazo de 12 (doze) meses contados da assinatura deste contrato.</w:t>
       </w:r>
     </w:p>
     <w:p>
@@ -453,7 +453,7 @@
       </w:pPr>
       <w:r>
         <w:rPr/>
-        <w:t xml:space="preserve">Entende-se por fase cada etapa eliminatória ou classificatória prevista no edital do certame.</w:t>
+        <w:t xml:space="preserve">Entende-se por fase cada etapa eliminatória ou classificatória prevista no edital do certame. Entende-se por mesma carreira ou cargo aquele cujas atribuições e requisitos sejam equivalentes aos do concurso indicado na cláusula 1, ainda que a denominação, o órgão ou o ente sejam diversos.</w:t>
       </w:r>
     </w:p>
     <w:p>
@@ -629,7 +629,7 @@
       </w:pPr>
       <w:r>
         <w:rPr/>
-        <w:t xml:space="preserve">o terceiro e os demais certames, além dos dois previstos na cláusula 1;</w:t>
+        <w:t xml:space="preserve">o terceiro e os demais concursos, além dos dois previstos na cláusula 1;</w:t>
       </w:r>
     </w:p>
     <w:p>
@@ -1258,7 +1258,7 @@
       </w:pPr>
       <w:r>
         <w:rPr/>
-        <w:t xml:space="preserve">A cobertura do segundo certame, prevista na cláusula 1, extingue-se com a publicação do edital que a acionar ou com o decurso do prazo de 24 meses contados da assinatura, o que ocorrer primeiro. Não publicado edital nesse prazo, a cobertura se extingue sem direito a restituição, uma vez que os honorários remuneram a disponibilidade do serviço durante todo o período.</w:t>
+        <w:t xml:space="preserve">A cobertura do segundo concurso, prevista na cláusula 1, extingue-se com a publicação do edital que a acionar ou com o decurso do prazo de 12 meses contados da assinatura, o que ocorrer primeiro. Não publicado edital nesse prazo, a cobertura se extingue sem direito a restituição, uma vez que os honorários remuneram a disponibilidade do serviço durante todo o período.</w:t>
       </w:r>
     </w:p>
     <w:p>

</xml_diff>